<commit_message>
Added all the required documentations and updated the modified n8n flow file
</commit_message>
<xml_diff>
--- a/Documentation/README.docx
+++ b/Documentation/README.docx
@@ -13,19 +13,13 @@
         <w:rPr>
           <w:lang w:val="en-US"/>
         </w:rPr>
-        <w:t xml:space="preserve">How Every List is Connected to </w:t>
-      </w:r>
-      <w:r>
-        <w:rPr>
-          <w:lang w:val="en-US"/>
-        </w:rPr>
-        <w:t>its</w:t>
-      </w:r>
-      <w:r>
-        <w:rPr>
-          <w:lang w:val="en-US"/>
-        </w:rPr>
-        <w:t xml:space="preserve"> Flow -</w:t>
+        <w:t xml:space="preserve">Short Explanation of Each Flow/List in its Category </w:t>
+      </w:r>
+      <w:r>
+        <w:rPr>
+          <w:lang w:val="en-US"/>
+        </w:rPr>
+        <w:t>-</w:t>
       </w:r>
       <w:r>
         <w:rPr>
@@ -129,7 +123,21 @@
         <w:rPr>
           <w:lang w:val="en-US"/>
         </w:rPr>
-        <w:t xml:space="preserve"> of these flows are in Power Automate. Some </w:t>
+        <w:t xml:space="preserve"> of these flows are in </w:t>
+      </w:r>
+      <w:r>
+        <w:rPr>
+          <w:b/>
+          <w:bCs/>
+          <w:lang w:val="en-US"/>
+        </w:rPr>
+        <w:t>Power Automate</w:t>
+      </w:r>
+      <w:r>
+        <w:rPr>
+          <w:lang w:val="en-US"/>
+        </w:rPr>
+        <w:t xml:space="preserve">. Some </w:t>
       </w:r>
       <w:r>
         <w:rPr>
@@ -141,7 +149,7 @@
         <w:rPr>
           <w:lang w:val="en-US"/>
         </w:rPr>
-        <w:t xml:space="preserve"> about all of each of these -</w:t>
+        <w:t xml:space="preserve"> about each of these -</w:t>
       </w:r>
     </w:p>
     <w:p>
@@ -199,6 +207,59 @@
           <w:lang w:val="en-US"/>
         </w:rPr>
         <w:br/>
+        <w:t>Their names in power automate are -</w:t>
+      </w:r>
+      <w:r>
+        <w:rPr>
+          <w:lang w:val="en-US"/>
+        </w:rPr>
+        <w:br/>
+        <w:t>SOD Snapshot – Dayshift flow in Team Daily Tracker</w:t>
+      </w:r>
+      <w:r>
+        <w:rPr>
+          <w:lang w:val="en-US"/>
+        </w:rPr>
+        <w:br/>
+        <w:t>SOD Snapshot – Nightshift flow in Team Daily Tracker</w:t>
+      </w:r>
+      <w:r>
+        <w:rPr>
+          <w:lang w:val="en-US"/>
+        </w:rPr>
+        <w:br/>
+      </w:r>
+      <w:r>
+        <w:rPr>
+          <w:lang w:val="en-US"/>
+        </w:rPr>
+        <w:br/>
+      </w:r>
+      <w:r>
+        <w:rPr>
+          <w:b/>
+          <w:bCs/>
+          <w:lang w:val="en-US"/>
+        </w:rPr>
+        <w:t>Team Daily Tracker</w:t>
+      </w:r>
+      <w:r>
+        <w:rPr>
+          <w:lang w:val="en-US"/>
+        </w:rPr>
+        <w:t xml:space="preserve"> is the name of the Team (in ms teams) in which the planner exists.</w:t>
+      </w:r>
+      <w:r>
+        <w:rPr>
+          <w:lang w:val="en-US"/>
+        </w:rPr>
+        <w:br/>
+      </w:r>
+      <w:r>
+        <w:rPr>
+          <w:lang w:val="en-US"/>
+        </w:rPr>
+        <w:br/>
       </w:r>
       <w:r>
         <w:rPr>
@@ -229,7 +290,19 @@
         <w:rPr>
           <w:lang w:val="en-US"/>
         </w:rPr>
-        <w:t>Any tasks placed in the SOD bucket before the extraction time are considered the users SOD tasks for that day.</w:t>
+        <w:t>Any tasks placed in the SOD bucket</w:t>
+      </w:r>
+      <w:r>
+        <w:rPr>
+          <w:lang w:val="en-US"/>
+        </w:rPr>
+        <w:t>(called the in Progress bucket)</w:t>
+      </w:r>
+      <w:r>
+        <w:rPr>
+          <w:lang w:val="en-US"/>
+        </w:rPr>
+        <w:t xml:space="preserve"> before the extraction time are considered the users SOD tasks for that day.</w:t>
       </w:r>
       <w:r>
         <w:rPr>
@@ -311,6 +384,33 @@
           <w:lang w:val="en-US"/>
         </w:rPr>
         <w:br/>
+        <w:t>Their names in power automate are -</w:t>
+      </w:r>
+      <w:r>
+        <w:rPr>
+          <w:lang w:val="en-US"/>
+        </w:rPr>
+        <w:br/>
+        <w:t>EOD Snapshot – Dayshift flow in Team Daily Tracker</w:t>
+      </w:r>
+      <w:r>
+        <w:rPr>
+          <w:lang w:val="en-US"/>
+        </w:rPr>
+        <w:br/>
+        <w:t>EOD Snapshot – Nightshift flow in Team Daily Tracker</w:t>
+      </w:r>
+      <w:r>
+        <w:rPr>
+          <w:lang w:val="en-US"/>
+        </w:rPr>
+        <w:br/>
+      </w:r>
+      <w:r>
+        <w:rPr>
+          <w:lang w:val="en-US"/>
+        </w:rPr>
+        <w:br/>
       </w:r>
       <w:r>
         <w:rPr>
@@ -438,7 +538,25 @@
           <w:lang w:val="en-US"/>
         </w:rPr>
         <w:br/>
-        <w:t>Once the EOD task details have been extracted from the planner, they are moved to the Past EOD’s bucket for 1 week, for users to review.</w:t>
+      </w:r>
+      <w:r>
+        <w:rPr>
+          <w:lang w:val="en-US"/>
+        </w:rPr>
+        <w:lastRenderedPageBreak/>
+        <w:t>Once the EOD task details have been extracted from the planner, they are moved to the Past EOD’s bucket for 1 week, for users</w:t>
+      </w:r>
+      <w:r>
+        <w:rPr>
+          <w:lang w:val="en-US"/>
+        </w:rPr>
+        <w:t>/Management</w:t>
+      </w:r>
+      <w:r>
+        <w:rPr>
+          <w:lang w:val="en-US"/>
+        </w:rPr>
+        <w:t xml:space="preserve"> to review.</w:t>
       </w:r>
       <w:r>
         <w:rPr>
@@ -511,6 +629,33 @@
           <w:lang w:val="en-US"/>
         </w:rPr>
         <w:br/>
+        <w:t>Their names in power automate are -</w:t>
+      </w:r>
+      <w:r>
+        <w:rPr>
+          <w:lang w:val="en-US"/>
+        </w:rPr>
+        <w:br/>
+        <w:t>Blocked Snapshot – Dayshift flow in Team Daily Tracker</w:t>
+      </w:r>
+      <w:r>
+        <w:rPr>
+          <w:lang w:val="en-US"/>
+        </w:rPr>
+        <w:br/>
+        <w:t>Blocked Snapshot – Nightshift flow in Team Daily Tracker</w:t>
+      </w:r>
+      <w:r>
+        <w:rPr>
+          <w:lang w:val="en-US"/>
+        </w:rPr>
+        <w:br/>
+      </w:r>
+      <w:r>
+        <w:rPr>
+          <w:lang w:val="en-US"/>
+        </w:rPr>
+        <w:br/>
         <w:t>Dayshift extraction flow runs at – 11:00PM From Monday to Saturday.</w:t>
       </w:r>
       <w:r>
@@ -531,14 +676,7 @@
           <w:lang w:val="en-US"/>
         </w:rPr>
         <w:br/>
-        <w:t xml:space="preserve">Any tasks placed in the Blocked bucket before the extraction time are considered </w:t>
-      </w:r>
-      <w:r>
-        <w:rPr>
-          <w:lang w:val="en-US"/>
-        </w:rPr>
-        <w:lastRenderedPageBreak/>
-        <w:t>the users Blocked tasks for that day.</w:t>
+        <w:t>Any tasks placed in the Blocked bucket before the extraction time are considered the users Blocked tasks for that day.</w:t>
       </w:r>
       <w:r>
         <w:rPr>
@@ -581,6 +719,17 @@
           <w:lang w:val="en-US"/>
         </w:rPr>
         <w:br/>
+      </w:r>
+      <w:r>
+        <w:rPr>
+          <w:lang w:val="en-US"/>
+        </w:rPr>
+        <w:br/>
+      </w:r>
+      <w:r>
+        <w:rPr>
+          <w:lang w:val="en-US"/>
+        </w:rPr>
         <w:t>As all the EOD tasks don’t get deleted instantaneously, they are placed in the Past EOD’s bucket for a week for review.</w:t>
       </w:r>
       <w:r>
@@ -588,6 +737,17 @@
           <w:lang w:val="en-US"/>
         </w:rPr>
         <w:br/>
+      </w:r>
+      <w:r>
+        <w:rPr>
+          <w:lang w:val="en-US"/>
+        </w:rPr>
+        <w:br/>
+      </w:r>
+      <w:r>
+        <w:rPr>
+          <w:lang w:val="en-US"/>
+        </w:rPr>
         <w:t>Once the week is up they are deleted completed removing them from the planner and only having their details saved in SharePoint.</w:t>
       </w:r>
       <w:r>
@@ -602,6 +762,41 @@
         </w:rPr>
         <w:br/>
         <w:t>The Flow runs every Monday at the same time for both Dayshift and Nightshift.</w:t>
+      </w:r>
+      <w:r>
+        <w:rPr>
+          <w:lang w:val="en-US"/>
+        </w:rPr>
+        <w:br/>
+      </w:r>
+      <w:r>
+        <w:rPr>
+          <w:b/>
+          <w:bCs/>
+          <w:u w:val="single"/>
+          <w:lang w:val="en-US"/>
+        </w:rPr>
+        <w:br/>
+      </w:r>
+      <w:r>
+        <w:rPr>
+          <w:lang w:val="en-US"/>
+        </w:rPr>
+        <w:t>Their names in power automate are -</w:t>
+      </w:r>
+      <w:r>
+        <w:rPr>
+          <w:lang w:val="en-US"/>
+        </w:rPr>
+        <w:br/>
+        <w:t>Clear Past EOD’s Bucket – Dayshift flow in Team Daily Tracker</w:t>
+      </w:r>
+      <w:r>
+        <w:rPr>
+          <w:lang w:val="en-US"/>
+        </w:rPr>
+        <w:br/>
+        <w:t>Clear Past EOD’s Bucket – Nightshift flow in Team Daily Tracker</w:t>
       </w:r>
       <w:r>
         <w:rPr>
@@ -695,8 +890,54 @@
         <w:rPr>
           <w:lang w:val="en-US"/>
         </w:rPr>
+        <w:lastRenderedPageBreak/>
         <w:br/>
         <w:t>The difference between them is that the SOD/EOD list is used for multiple other flows because of which it only has 45 Days of data, whereas the All SOD/EOD list contains all the data since the data collection had begun, without the restrictions of number of days it contains all the data.</w:t>
+      </w:r>
+      <w:r>
+        <w:rPr>
+          <w:lang w:val="en-US"/>
+        </w:rPr>
+        <w:br/>
+      </w:r>
+      <w:r>
+        <w:rPr>
+          <w:lang w:val="en-US"/>
+        </w:rPr>
+        <w:br/>
+        <w:t xml:space="preserve">There is not direct 45 day limit available in SharePoint. So in order for this to work I have created another flow called </w:t>
+      </w:r>
+      <w:r>
+        <w:rPr>
+          <w:lang w:val="en-US"/>
+        </w:rPr>
+        <w:t>‘SOD/EOD List Cleanup’.</w:t>
+      </w:r>
+      <w:r>
+        <w:rPr>
+          <w:lang w:val="en-US"/>
+        </w:rPr>
+        <w:br/>
+      </w:r>
+      <w:r>
+        <w:rPr>
+          <w:lang w:val="en-US"/>
+        </w:rPr>
+        <w:br/>
+        <w:t>This flow runs everyday at 09:00AM, any row that has snapshot date prior to the 45 day limit, it gets deleted.</w:t>
+      </w:r>
+      <w:r>
+        <w:rPr>
+          <w:lang w:val="en-US"/>
+        </w:rPr>
+        <w:br/>
+      </w:r>
+      <w:r>
+        <w:rPr>
+          <w:lang w:val="en-US"/>
+        </w:rPr>
+        <w:br/>
+        <w:t>This flow also does the same thing with 2 other lists, Daily Task Utilization list and the Daily Compliance List(Details of both of these lists are also mentioned in this doc).</w:t>
       </w:r>
     </w:p>
     <w:p>
@@ -749,7 +990,31 @@
         <w:rPr>
           <w:lang w:val="en-US"/>
         </w:rPr>
-        <w:t xml:space="preserve"> flow executes and creates a summary of the data that was just collected and then posts that summary on a </w:t>
+        <w:t xml:space="preserve"> flow executes and creates a summary of the data that was just collected and then posts th</w:t>
+      </w:r>
+      <w:r>
+        <w:rPr>
+          <w:lang w:val="en-US"/>
+        </w:rPr>
+        <w:t>ose</w:t>
+      </w:r>
+      <w:r>
+        <w:rPr>
+          <w:lang w:val="en-US"/>
+        </w:rPr>
+        <w:t xml:space="preserve"> summar</w:t>
+      </w:r>
+      <w:r>
+        <w:rPr>
+          <w:lang w:val="en-US"/>
+        </w:rPr>
+        <w:t>ies</w:t>
+      </w:r>
+      <w:r>
+        <w:rPr>
+          <w:lang w:val="en-US"/>
+        </w:rPr>
+        <w:t xml:space="preserve"> on </w:t>
       </w:r>
       <w:r>
         <w:rPr>
@@ -771,16 +1036,37 @@
       </w:r>
     </w:p>
     <w:p>
-      <w:pPr>
-        <w:rPr>
-          <w:lang w:val="en-US"/>
-        </w:rPr>
-      </w:pPr>
-      <w:r>
-        <w:rPr>
-          <w:lang w:val="en-US"/>
-        </w:rPr>
-        <w:t>Also, all these flows require Microsoft graph API permissions for them to work. I have added these permissions to a new registered app on Azure Portal.</w:t>
+      <w:r>
+        <w:rPr>
+          <w:lang w:val="en-US"/>
+        </w:rPr>
+        <w:t>Also, all these flows require Microsoft graph API permissions for them to work. I have added these permissions to a new registered app on Azure Portal</w:t>
+      </w:r>
+      <w:r>
+        <w:rPr>
+          <w:lang w:val="en-US"/>
+        </w:rPr>
+        <w:t>, the name of the app is ‘</w:t>
+      </w:r>
+      <w:r>
+        <w:rPr>
+          <w:b/>
+          <w:bCs/>
+        </w:rPr>
+        <w:t>n8n-legitBytes-summary-flow</w:t>
+      </w:r>
+      <w:r>
+        <w:rPr>
+          <w:b/>
+          <w:bCs/>
+        </w:rPr>
+        <w:t xml:space="preserve">’. </w:t>
+      </w:r>
+      <w:r>
+        <w:t>This is very important as in the future if any new features need to be added to any of the n8n flows (that require graph API) will have to access this app on the Azure Portal.</w:t>
+      </w:r>
+      <w:r>
+        <w:br/>
       </w:r>
     </w:p>
     <w:p>
@@ -864,7 +1150,6 @@
         <w:rPr>
           <w:lang w:val="en-US"/>
         </w:rPr>
-        <w:lastRenderedPageBreak/>
         <w:br/>
         <w:t>They use the data already in SharePoint and then using JavaScript code, the flow creates summary messages in the form of adaptive cards, Best format for posting messages on teams, and then finally posts the message on the teams channel of dayshift and nightshift separately.</w:t>
       </w:r>
@@ -896,6 +1181,7 @@
           <w:u w:val="single"/>
           <w:lang w:val="en-US"/>
         </w:rPr>
+        <w:lastRenderedPageBreak/>
         <w:t>EOD Summary Flow (Dayshift and Nightshift):</w:t>
       </w:r>
       <w:r>
@@ -981,13 +1267,49 @@
         <w:rPr>
           <w:lang w:val="en-US"/>
         </w:rPr>
-        <w:t xml:space="preserve">The main list called SOD/EOD list is being used for a lot of n8n flows. Because of a limitation in n8n, i.e., </w:t>
-      </w:r>
-      <w:r>
-        <w:rPr>
-          <w:lang w:val="en-US"/>
-        </w:rPr>
-        <w:t>it is only able to fetch 5000 rows of a SharePoint list in one go. So because of this limitation SOD/EOD list needs to no more than 5000 rows. And we have done this by creating a 45-day limit in the list, any task which is prior to 45 days from today will get deleted.</w:t>
+        <w:t>The main list called SOD/EOD list is being used for a lot of n8n</w:t>
+      </w:r>
+      <w:r>
+        <w:rPr>
+          <w:lang w:val="en-US"/>
+        </w:rPr>
+        <w:t xml:space="preserve"> and power automate</w:t>
+      </w:r>
+      <w:r>
+        <w:rPr>
+          <w:lang w:val="en-US"/>
+        </w:rPr>
+        <w:t xml:space="preserve"> flows. Because of a limitation in n8n</w:t>
+      </w:r>
+      <w:r>
+        <w:rPr>
+          <w:lang w:val="en-US"/>
+        </w:rPr>
+        <w:t xml:space="preserve"> and power automate</w:t>
+      </w:r>
+      <w:r>
+        <w:rPr>
+          <w:lang w:val="en-US"/>
+        </w:rPr>
+        <w:t xml:space="preserve">, i.e., </w:t>
+      </w:r>
+      <w:r>
+        <w:rPr>
+          <w:lang w:val="en-US"/>
+        </w:rPr>
+        <w:t>it is only able to fetch 5000 rows of a SharePoint list in one go.</w:t>
+      </w:r>
+      <w:r>
+        <w:rPr>
+          <w:lang w:val="en-US"/>
+        </w:rPr>
+        <w:t xml:space="preserve"> </w:t>
+      </w:r>
+      <w:r>
+        <w:rPr>
+          <w:lang w:val="en-US"/>
+        </w:rPr>
+        <w:t>So because of this limitation SOD/EOD list needs to no more than 5000 rows. And we have done this by creating a 45-day limit in the list, any task which is prior to 45 days from today will get deleted.</w:t>
       </w:r>
     </w:p>
     <w:p>
@@ -1153,7 +1475,6 @@
         <w:rPr>
           <w:lang w:val="en-US"/>
         </w:rPr>
-        <w:lastRenderedPageBreak/>
         <w:t xml:space="preserve">As the tasks for </w:t>
       </w:r>
       <w:r>
@@ -1184,21 +1505,7 @@
         <w:rPr>
           <w:lang w:val="en-US"/>
         </w:rPr>
-        <w:t xml:space="preserve">their tasks will be added a new planner in a separate team, called </w:t>
-      </w:r>
-      <w:proofErr w:type="spellStart"/>
-      <w:r>
-        <w:rPr>
-          <w:lang w:val="en-US"/>
-        </w:rPr>
-        <w:t>LegitBytes</w:t>
-      </w:r>
-      <w:proofErr w:type="spellEnd"/>
-      <w:r>
-        <w:rPr>
-          <w:lang w:val="en-US"/>
-        </w:rPr>
-        <w:t>, on the channel called HR.</w:t>
+        <w:t>their tasks will be added a new planner in a separate team, called LegitBytes, on the channel called HR.</w:t>
       </w:r>
     </w:p>
     <w:p>
@@ -1212,6 +1519,19 @@
           <w:lang w:val="en-US"/>
         </w:rPr>
         <w:t>The timings of these channels/planner’s flows are the same as that of the Dayshift.</w:t>
+      </w:r>
+    </w:p>
+    <w:p>
+      <w:pPr>
+        <w:rPr>
+          <w:lang w:val="en-US"/>
+        </w:rPr>
+      </w:pPr>
+      <w:r>
+        <w:rPr>
+          <w:lang w:val="en-US"/>
+        </w:rPr>
+        <w:t>Both the list’s that were mentioned above also exist here, but in the HR channel.</w:t>
       </w:r>
     </w:p>
     <w:p>
@@ -1229,6 +1549,7 @@
         <w:rPr>
           <w:lang w:val="en-US"/>
         </w:rPr>
+        <w:lastRenderedPageBreak/>
         <w:t>Story Point/Utilization flows –</w:t>
       </w:r>
     </w:p>
@@ -1557,53 +1878,53 @@
         <w:rPr>
           <w:lang w:val="en-US"/>
         </w:rPr>
+        <w:t>Attendance Summary Flow –</w:t>
+      </w:r>
+    </w:p>
+    <w:p>
+      <w:pPr>
+        <w:rPr>
+          <w:lang w:val="en-US"/>
+        </w:rPr>
+      </w:pPr>
+      <w:r>
+        <w:rPr>
+          <w:lang w:val="en-US"/>
+        </w:rPr>
+        <w:t>Legitbytes uses greythr for tracking leaves and times of arrival/leave from the office. As we don’t have the API of greythr, we had to extract the “</w:t>
+      </w:r>
+      <w:r>
+        <w:rPr>
+          <w:b/>
+          <w:bCs/>
+          <w:lang w:val="en-US"/>
+        </w:rPr>
+        <w:t>Monthly Attendance Muster Report</w:t>
+      </w:r>
+      <w:r>
+        <w:rPr>
+          <w:lang w:val="en-US"/>
+        </w:rPr>
+        <w:t>” from greythr’s reports generation section manually</w:t>
+      </w:r>
+      <w:r>
+        <w:rPr>
+          <w:lang w:val="en-US"/>
+        </w:rPr>
+        <w:t>.</w:t>
+      </w:r>
+    </w:p>
+    <w:p>
+      <w:pPr>
+        <w:rPr>
+          <w:lang w:val="en-US"/>
+        </w:rPr>
+      </w:pPr>
+      <w:r>
+        <w:rPr>
+          <w:lang w:val="en-US"/>
+        </w:rPr>
         <w:lastRenderedPageBreak/>
-        <w:t>Attendance Summary Flow –</w:t>
-      </w:r>
-    </w:p>
-    <w:p>
-      <w:pPr>
-        <w:rPr>
-          <w:lang w:val="en-US"/>
-        </w:rPr>
-      </w:pPr>
-      <w:r>
-        <w:rPr>
-          <w:lang w:val="en-US"/>
-        </w:rPr>
-        <w:t>Legitbytes uses greythr for tracking leaves and times of arrival/leave from the office. As we don’t have the API of greythr, we had to extract the “</w:t>
-      </w:r>
-      <w:r>
-        <w:rPr>
-          <w:b/>
-          <w:bCs/>
-          <w:lang w:val="en-US"/>
-        </w:rPr>
-        <w:t>Monthly Attendance Muster Report</w:t>
-      </w:r>
-      <w:r>
-        <w:rPr>
-          <w:lang w:val="en-US"/>
-        </w:rPr>
-        <w:t>” from greythr’s reports generation section manually</w:t>
-      </w:r>
-      <w:r>
-        <w:rPr>
-          <w:lang w:val="en-US"/>
-        </w:rPr>
-        <w:t>.</w:t>
-      </w:r>
-    </w:p>
-    <w:p>
-      <w:pPr>
-        <w:rPr>
-          <w:lang w:val="en-US"/>
-        </w:rPr>
-      </w:pPr>
-      <w:r>
-        <w:rPr>
-          <w:lang w:val="en-US"/>
-        </w:rPr>
         <w:t xml:space="preserve">HR extracts the report and adds that </w:t>
       </w:r>
       <w:r>
@@ -1862,7 +2183,31 @@
         <w:rPr>
           <w:lang w:val="en-US"/>
         </w:rPr>
-        <w:t xml:space="preserve"> This flow runs one hour after every EOD task extraction flow. All this flow does is summarize the performance of each employee that day, i.e., if the employee has posted a SOD or EOD that day, or if the employee has any delayed tasks(Also the number of delayed tasks) that day, and finally adds this data to a list in SharePoint called ‘Employee Compliance’.</w:t>
+        <w:t xml:space="preserve"> Th</w:t>
+      </w:r>
+      <w:r>
+        <w:rPr>
+          <w:lang w:val="en-US"/>
+        </w:rPr>
+        <w:t>ese</w:t>
+      </w:r>
+      <w:r>
+        <w:rPr>
+          <w:lang w:val="en-US"/>
+        </w:rPr>
+        <w:t xml:space="preserve"> flow</w:t>
+      </w:r>
+      <w:r>
+        <w:rPr>
+          <w:lang w:val="en-US"/>
+        </w:rPr>
+        <w:t>s</w:t>
+      </w:r>
+      <w:r>
+        <w:rPr>
+          <w:lang w:val="en-US"/>
+        </w:rPr>
+        <w:t xml:space="preserve"> run one hour after every EOD task extraction flow. All this flow does is summarize the performance of each employee that day, i.e., if the employee has posted a SOD or EOD that day, or if the employee has any delayed tasks(Also the number of delayed tasks) that day, and finally adds this data to a list in SharePoint called ‘Employee Compliance’.</w:t>
       </w:r>
       <w:r>
         <w:rPr>
@@ -1877,21 +2222,7 @@
             <w:rStyle w:val="Hyperlink"/>
             <w:lang w:val="en-US"/>
           </w:rPr>
-          <w:t>LI</w:t>
-        </w:r>
-        <w:r>
-          <w:rPr>
-            <w:rStyle w:val="Hyperlink"/>
-            <w:lang w:val="en-US"/>
-          </w:rPr>
-          <w:t>N</w:t>
-        </w:r>
-        <w:r>
-          <w:rPr>
-            <w:rStyle w:val="Hyperlink"/>
-            <w:lang w:val="en-US"/>
-          </w:rPr>
-          <w:t>K</w:t>
+          <w:t>LINK</w:t>
         </w:r>
       </w:hyperlink>
       <w:r>
@@ -1980,6 +2311,7 @@
         <w:rPr>
           <w:lang w:val="en-US"/>
         </w:rPr>
+        <w:lastRenderedPageBreak/>
         <w:t xml:space="preserve">The reason for using monthly attendance muster report with employee compliance is that the Employee Compliance list does not tell us about the </w:t>
       </w:r>
       <w:r>
@@ -2069,24 +2401,292 @@
           <w:t>LINK</w:t>
         </w:r>
       </w:hyperlink>
-    </w:p>
-    <w:p>
-      <w:pPr>
-        <w:rPr>
-          <w:lang w:val="en-US"/>
-        </w:rPr>
-      </w:pPr>
-      <w:r>
-        <w:rPr>
-          <w:lang w:val="en-US"/>
-        </w:rPr>
-        <w:br/>
-      </w:r>
-    </w:p>
-    <w:p>
-      <w:pPr>
-        <w:rPr>
-          <w:lang w:val="en-US"/>
+      <w:r>
+        <w:br/>
+      </w:r>
+      <w:r>
+        <w:br/>
+        <w:t xml:space="preserve">FINALY the last list that this flow uses is </w:t>
+      </w:r>
+      <w:r>
+        <w:rPr>
+          <w:b/>
+          <w:bCs/>
+        </w:rPr>
+        <w:t>‘All Employees List’</w:t>
+      </w:r>
+      <w:r>
+        <w:rPr>
+          <w:b/>
+          <w:bCs/>
+        </w:rPr>
+        <w:t xml:space="preserve"> </w:t>
+      </w:r>
+      <w:r>
+        <w:t>this list contains the details of all active employees, which is required for this flow to run seamlessly.</w:t>
+      </w:r>
+    </w:p>
+    <w:p>
+      <w:pPr>
+        <w:pStyle w:val="Heading1"/>
+        <w:rPr>
+          <w:lang w:val="en-US"/>
+        </w:rPr>
+      </w:pPr>
+      <w:r>
+        <w:rPr>
+          <w:lang w:val="en-US"/>
+        </w:rPr>
+        <w:t>Technical Support -</w:t>
+      </w:r>
+    </w:p>
+    <w:p>
+      <w:pPr>
+        <w:rPr>
+          <w:lang w:val="en-US"/>
+        </w:rPr>
+      </w:pPr>
+      <w:r>
+        <w:rPr>
+          <w:lang w:val="en-US"/>
+        </w:rPr>
+        <w:br/>
+        <w:t>There are a few details everyone should keep in mind –</w:t>
+      </w:r>
+    </w:p>
+    <w:p>
+      <w:pPr>
+        <w:pStyle w:val="ListParagraph"/>
+        <w:numPr>
+          <w:ilvl w:val="0"/>
+          <w:numId w:val="5"/>
+        </w:numPr>
+        <w:rPr>
+          <w:lang w:val="en-US"/>
+        </w:rPr>
+      </w:pPr>
+      <w:r>
+        <w:rPr>
+          <w:lang w:val="en-US"/>
+        </w:rPr>
+        <w:t>Labels: All labels in planner are named and positioned exactly as required by power automate, meaning no one should freely change the name or position of any of the labels.</w:t>
+      </w:r>
+      <w:r>
+        <w:rPr>
+          <w:lang w:val="en-US"/>
+        </w:rPr>
+        <w:br/>
+      </w:r>
+      <w:r>
+        <w:rPr>
+          <w:lang w:val="en-US"/>
+        </w:rPr>
+        <w:br/>
+        <w:t xml:space="preserve">REASON for this is power automate does not see the name of any of the labels from planner, what power automate is able to extract(or to be precise what planner is able to provide) is the number at which the label is, meaning what we see in planner, the blue, red, brown, ect. is not provided to power automate. What we see is Category1, Category2, Category3, ect. </w:t>
+      </w:r>
+      <w:r>
+        <w:rPr>
+          <w:lang w:val="en-US"/>
+        </w:rPr>
+        <w:br/>
+      </w:r>
+      <w:r>
+        <w:rPr>
+          <w:lang w:val="en-US"/>
+        </w:rPr>
+        <w:br/>
+        <w:t>FIX what the power automate flow does is maps these Category1, Category2, Category3, ect. to the exact name of the label we want, i.e., team name or story point.</w:t>
+      </w:r>
+      <w:r>
+        <w:rPr>
+          <w:lang w:val="en-US"/>
+        </w:rPr>
+        <w:br/>
+      </w:r>
+      <w:r>
+        <w:rPr>
+          <w:lang w:val="en-US"/>
+        </w:rPr>
+        <w:br/>
+        <w:t>Which means if anyone wishes to change or add a new team name or project name they need to also change the small code in the power automate SOD/EOD extraction flows.</w:t>
+      </w:r>
+      <w:r>
+        <w:rPr>
+          <w:lang w:val="en-US"/>
+        </w:rPr>
+        <w:br/>
+      </w:r>
+      <w:r>
+        <w:rPr>
+          <w:lang w:val="en-US"/>
+        </w:rPr>
+        <w:br/>
+        <w:t>As mentioned above there are 6 flows that need to be changed, 3 for dayshift and 3 for nightshift. If the new team is of dayshift only then change only those 3 flows.</w:t>
+      </w:r>
+      <w:r>
+        <w:rPr>
+          <w:lang w:val="en-US"/>
+        </w:rPr>
+        <w:br/>
+      </w:r>
+      <w:r>
+        <w:rPr>
+          <w:lang w:val="en-US"/>
+        </w:rPr>
+        <w:br/>
+        <w:t>WHAT NEEDS TO BE CHANGED IN THE FLOW, there is a create item</w:t>
+      </w:r>
+      <w:r>
+        <w:rPr>
+          <w:lang w:val="en-US"/>
+        </w:rPr>
+        <w:t xml:space="preserve"> </w:t>
+      </w:r>
+      <w:r>
+        <w:rPr>
+          <w:lang w:val="en-US"/>
+        </w:rPr>
+        <w:t>node</w:t>
+      </w:r>
+      <w:r>
+        <w:rPr>
+          <w:lang w:val="en-US"/>
+        </w:rPr>
+        <w:t xml:space="preserve">(by </w:t>
+      </w:r>
+      <w:r>
+        <w:rPr>
+          <w:lang w:val="en-US"/>
+        </w:rPr>
+        <w:lastRenderedPageBreak/>
+        <w:t>SharePoint)</w:t>
+      </w:r>
+      <w:r>
+        <w:rPr>
+          <w:lang w:val="en-US"/>
+        </w:rPr>
+        <w:t xml:space="preserve"> in each of these flows (2 create item nodes in EOD snapshot flows)</w:t>
+      </w:r>
+      <w:r>
+        <w:rPr>
+          <w:lang w:val="en-US"/>
+        </w:rPr>
+        <w:t>, these are the nodes responsible for adding new items to SharePoint. In this node change the expression in the team name column. The code in this node is quite self-explanatory, so no just edit it after a little analysis.</w:t>
+      </w:r>
+    </w:p>
+    <w:p>
+      <w:pPr>
+        <w:pStyle w:val="ListParagraph"/>
+        <w:numPr>
+          <w:ilvl w:val="0"/>
+          <w:numId w:val="5"/>
+        </w:numPr>
+        <w:rPr>
+          <w:b/>
+          <w:bCs/>
+        </w:rPr>
+      </w:pPr>
+      <w:r>
+        <w:rPr>
+          <w:lang w:val="en-US"/>
+        </w:rPr>
+        <w:t xml:space="preserve">Microsoft Graph API: On the Azure Portal, the app through which all the n8n flows are currently connected to </w:t>
+      </w:r>
+      <w:r>
+        <w:rPr>
+          <w:lang w:val="en-US"/>
+        </w:rPr>
+        <w:t xml:space="preserve">is called </w:t>
+      </w:r>
+      <w:r>
+        <w:rPr>
+          <w:b/>
+          <w:bCs/>
+        </w:rPr>
+        <w:t>n8n-legitBytes-summary-flow</w:t>
+      </w:r>
+      <w:r>
+        <w:rPr>
+          <w:b/>
+          <w:bCs/>
+        </w:rPr>
+        <w:t xml:space="preserve"> </w:t>
+      </w:r>
+      <w:r>
+        <w:t>and any new permission that is required by any new project under the configuration of this app, needs to be added through the Azure Portal itself.</w:t>
+      </w:r>
+      <w:r>
+        <w:br/>
+      </w:r>
+      <w:r>
+        <w:br/>
+        <w:t>The client id and client secret are provided in another document called ID’s.</w:t>
+      </w:r>
+      <w:r>
+        <w:br/>
+      </w:r>
+      <w:r>
+        <w:br/>
+        <w:t>Using these client id and client secrets one can create the credentials on n8n.</w:t>
+      </w:r>
+      <w:r>
+        <w:br/>
+      </w:r>
+      <w:r>
+        <w:br/>
+        <w:t>This is important because most of the nodes that are being used in n8n require these Graph API permissions, and these can only be accessed and used through the Azure Portal and Client id and Secret.</w:t>
+      </w:r>
+      <w:r>
+        <w:br/>
+      </w:r>
+    </w:p>
+    <w:p>
+      <w:pPr>
+        <w:pStyle w:val="ListParagraph"/>
+        <w:numPr>
+          <w:ilvl w:val="0"/>
+          <w:numId w:val="5"/>
+        </w:numPr>
+        <w:rPr>
+          <w:b/>
+          <w:bCs/>
+        </w:rPr>
+      </w:pPr>
+      <w:r>
+        <w:rPr>
+          <w:b/>
+          <w:bCs/>
+        </w:rPr>
+        <w:t xml:space="preserve">All Employees List: </w:t>
+      </w:r>
+      <w:r>
+        <w:t>This list is being used in Daily And Monthly Compliance Flows.</w:t>
+      </w:r>
+      <w:r>
+        <w:br/>
+      </w:r>
+      <w:r>
+        <w:br/>
+        <w:t>ISSUES – The problem is that this list will soon be forgotten and the Master Employee list will get in use.</w:t>
+      </w:r>
+      <w:r>
+        <w:br/>
+        <w:t>Once this happens both the above mentioned flows should be restructured to now use this new Master Employee List and abandon the old list.</w:t>
+      </w:r>
+    </w:p>
+    <w:p>
+      <w:pPr>
+        <w:rPr>
+          <w:b/>
+          <w:bCs/>
+        </w:rPr>
+      </w:pPr>
+    </w:p>
+    <w:p>
+      <w:pPr>
+        <w:rPr>
+          <w:b/>
+          <w:bCs/>
         </w:rPr>
       </w:pPr>
     </w:p>
@@ -2482,6 +3082,95 @@
       </w:pPr>
     </w:lvl>
   </w:abstractNum>
+  <w:abstractNum w:abstractNumId="4" w15:restartNumberingAfterBreak="0">
+    <w:nsid w:val="79E0639A"/>
+    <w:multiLevelType w:val="hybridMultilevel"/>
+    <w:tmpl w:val="1EAE3C02"/>
+    <w:lvl w:ilvl="0" w:tplc="4009000F">
+      <w:start w:val="1"/>
+      <w:numFmt w:val="decimal"/>
+      <w:lvlText w:val="%1."/>
+      <w:lvlJc w:val="left"/>
+      <w:pPr>
+        <w:ind w:left="720" w:hanging="360"/>
+      </w:pPr>
+      <w:rPr>
+        <w:rFonts w:hint="default"/>
+      </w:rPr>
+    </w:lvl>
+    <w:lvl w:ilvl="1" w:tplc="40090019" w:tentative="1">
+      <w:start w:val="1"/>
+      <w:numFmt w:val="lowerLetter"/>
+      <w:lvlText w:val="%2."/>
+      <w:lvlJc w:val="left"/>
+      <w:pPr>
+        <w:ind w:left="1440" w:hanging="360"/>
+      </w:pPr>
+    </w:lvl>
+    <w:lvl w:ilvl="2" w:tplc="4009001B" w:tentative="1">
+      <w:start w:val="1"/>
+      <w:numFmt w:val="lowerRoman"/>
+      <w:lvlText w:val="%3."/>
+      <w:lvlJc w:val="right"/>
+      <w:pPr>
+        <w:ind w:left="2160" w:hanging="180"/>
+      </w:pPr>
+    </w:lvl>
+    <w:lvl w:ilvl="3" w:tplc="4009000F" w:tentative="1">
+      <w:start w:val="1"/>
+      <w:numFmt w:val="decimal"/>
+      <w:lvlText w:val="%4."/>
+      <w:lvlJc w:val="left"/>
+      <w:pPr>
+        <w:ind w:left="2880" w:hanging="360"/>
+      </w:pPr>
+    </w:lvl>
+    <w:lvl w:ilvl="4" w:tplc="40090019" w:tentative="1">
+      <w:start w:val="1"/>
+      <w:numFmt w:val="lowerLetter"/>
+      <w:lvlText w:val="%5."/>
+      <w:lvlJc w:val="left"/>
+      <w:pPr>
+        <w:ind w:left="3600" w:hanging="360"/>
+      </w:pPr>
+    </w:lvl>
+    <w:lvl w:ilvl="5" w:tplc="4009001B" w:tentative="1">
+      <w:start w:val="1"/>
+      <w:numFmt w:val="lowerRoman"/>
+      <w:lvlText w:val="%6."/>
+      <w:lvlJc w:val="right"/>
+      <w:pPr>
+        <w:ind w:left="4320" w:hanging="180"/>
+      </w:pPr>
+    </w:lvl>
+    <w:lvl w:ilvl="6" w:tplc="4009000F" w:tentative="1">
+      <w:start w:val="1"/>
+      <w:numFmt w:val="decimal"/>
+      <w:lvlText w:val="%7."/>
+      <w:lvlJc w:val="left"/>
+      <w:pPr>
+        <w:ind w:left="5040" w:hanging="360"/>
+      </w:pPr>
+    </w:lvl>
+    <w:lvl w:ilvl="7" w:tplc="40090019" w:tentative="1">
+      <w:start w:val="1"/>
+      <w:numFmt w:val="lowerLetter"/>
+      <w:lvlText w:val="%8."/>
+      <w:lvlJc w:val="left"/>
+      <w:pPr>
+        <w:ind w:left="5760" w:hanging="360"/>
+      </w:pPr>
+    </w:lvl>
+    <w:lvl w:ilvl="8" w:tplc="4009001B" w:tentative="1">
+      <w:start w:val="1"/>
+      <w:numFmt w:val="lowerRoman"/>
+      <w:lvlText w:val="%9."/>
+      <w:lvlJc w:val="right"/>
+      <w:pPr>
+        <w:ind w:left="6480" w:hanging="180"/>
+      </w:pPr>
+    </w:lvl>
+  </w:abstractNum>
   <w:num w:numId="1" w16cid:durableId="550075014">
     <w:abstractNumId w:val="3"/>
   </w:num>
@@ -2493,6 +3182,9 @@
   </w:num>
   <w:num w:numId="4" w16cid:durableId="1840538437">
     <w:abstractNumId w:val="0"/>
+  </w:num>
+  <w:num w:numId="5" w16cid:durableId="1657493209">
+    <w:abstractNumId w:val="4"/>
   </w:num>
 </w:numbering>
 </file>

</xml_diff>